<commit_message>
Update LIA to v1.1 — add Open Government Licence references
</commit_message>
<xml_diff>
--- a/docs/AlwaysReady-LIA-Direct-Marketing.docx
+++ b/docs/AlwaysReady-LIA-Direct-Marketing.docx
@@ -267,7 +267,49 @@
                 <w:sz w:val="20"/>
                 <w:szCs w:val="20"/>
               </w:rPr>
-              <w:t xml:space="preserve">1.0</w:t>
+              <w:t xml:space="preserve">1.1</w:t>
+            </w:r>
+          </w:p>
+        </w:tc>
+      </w:tr>
+      <w:tr>
+        <w:tc>
+          <w:tcPr>
+            <w:tcW w:type="dxa" w:w="2200"/>
+            <w:shd w:fill="F5F5F5" w:val="clear"/>
+            <w:vAlign w:val="top"/>
+          </w:tcPr>
+          <w:p>
+            <w:pPr>
+              <w:spacing w:after="60" w:before="60"/>
+            </w:pPr>
+            <w:r>
+              <w:rPr>
+                <w:b/>
+                <w:bCs/>
+                <w:sz w:val="20"/>
+                <w:szCs w:val="20"/>
+              </w:rPr>
+              <w:t xml:space="preserve">Data source</w:t>
+            </w:r>
+          </w:p>
+        </w:tc>
+        <w:tc>
+          <w:tcPr>
+            <w:tcW w:type="dxa" w:w="5900"/>
+            <w:shd w:fill="FFFFFF" w:val="clear"/>
+            <w:vAlign w:val="top"/>
+          </w:tcPr>
+          <w:p>
+            <w:pPr>
+              <w:spacing w:after="60" w:before="60"/>
+            </w:pPr>
+            <w:r>
+              <w:rPr>
+                <w:sz w:val="20"/>
+                <w:szCs w:val="20"/>
+              </w:rPr>
+              <w:t xml:space="preserve">CQC Care Directory with Ratings — published under the Open Government Licence v3.0</w:t>
             </w:r>
           </w:p>
         </w:tc>
@@ -509,7 +551,7 @@
           <w:sz w:val="22"/>
           <w:szCs w:val="22"/>
         </w:rPr>
-        <w:t xml:space="preserve">CQC rating — from the CQC public register (published and freely accessible)</w:t>
+        <w:t xml:space="preserve">CQC rating — from the CQC "Care Directory with Ratings", published under the Open Government Licence v3.0</w:t>
       </w:r>
     </w:p>
     <w:p>
@@ -538,7 +580,7 @@
           <w:sz w:val="22"/>
           <w:szCs w:val="22"/>
         </w:rPr>
-        <w:t xml:space="preserve">We do not purchase or use third-party marketing lists. We source data only from the CQC's publicly published register, which providers are required by law to be listed on.</w:t>
+        <w:t xml:space="preserve">We do not purchase or use third-party marketing lists. We source data exclusively from the CQC's "Care Directory with Ratings" — a dataset published by CQC under the Open Government Licence v3.0 (OGL). The OGL explicitly permits reuse of CQC data for any purpose, including commercial use, provided the source is acknowledged. CQC publishes this file specifically to enable organisations to use inspection and rating data. Our use of this dataset is consistent with the licence under which it was made available.</w:t>
       </w:r>
     </w:p>
     <w:p>
@@ -721,7 +763,7 @@
           <w:sz w:val="22"/>
           <w:szCs w:val="22"/>
         </w:rPr>
-        <w:t xml:space="preserve">CQC ratings are published publicly and are a matter of public record. Using a publicly available rating to determine whether to make contact is not materially different from a sales representative researching a prospect online before calling.</w:t>
+        <w:t xml:space="preserve">CQC ratings are published publicly and are a matter of public record. CQC explicitly publishes its "Care Directory with Ratings" under the Open Government Licence to enable exactly this kind of reuse. Providers are required by law to be registered with CQC and are aware their rating is published. Using a publicly available, OGL-licensed dataset to determine whether to make contact is not materially different from a sales representative researching a prospect online before calling — and is a use CQC itself has sanctioned through the licence it has chosen.</w:t>
       </w:r>
     </w:p>
     <w:p>
@@ -1107,6 +1149,23 @@
           <w:szCs w:val="22"/>
         </w:rPr>
         <w:t xml:space="preserve">This LIA will be reviewed before each new campaign and updated if the scope or method changes</w:t>
+      </w:r>
+    </w:p>
+    <w:p>
+      <w:pPr>
+        <w:pStyle w:val="ListParagraph"/>
+        <w:numPr>
+          <w:ilvl w:val="0"/>
+          <w:numId w:val="1"/>
+        </w:numPr>
+        <w:spacing w:after="40" w:before="40"/>
+      </w:pPr>
+      <w:r>
+        <w:rPr>
+          <w:sz w:val="22"/>
+          <w:szCs w:val="22"/>
+        </w:rPr>
+        <w:t xml:space="preserve">All communications will acknowledge that provider data was sourced from CQC, in compliance with the Open Government Licence attribution requirement</w:t>
       </w:r>
     </w:p>
     <w:p>

</xml_diff>